<commit_message>
Poster v7: reframe soil-table column and trim for legibility
Column header change: 'Failure-driven?' forced a binary onto processes that
are not binary. Now 'What increases it' - Pathogens: hydraulic failure.
Nitrogen: always, worse on failure. Phosphorus: system age, saturation can
remobilise. PFAS: always regardless of condition. Resolves the conflict
between the two review comments without hedging the useful contrast.

Legibility trim: body 13.5->15pt, tables/captions/callouts up, column 2
widened to 1.28fr so the cross-section dominates. Dropped the drainfield-
footprint pathway row and its data gap (weakest link), 3 partnership tags,
2 references, ~15% of prose.
</commit_message>
<xml_diff>
--- a/deliverables/POSTER_CONTENT_AND_LAYOUT.docx
+++ b/deliverables/POSTER_CONTENT_AND_LAYOUT.docx
@@ -1120,7 +1120,7 @@
               <w:jc w:val="left"/>
             </w:pPr>
             <w:r>
-              <w:t xml:space="preserve">14.5 pt</w:t>
+              <w:t xml:space="preserve">15 pt</w:t>
             </w:r>
           </w:p>
         </w:tc>
@@ -1337,13 +1337,29 @@
           <w:bCs/>
           <w:b/>
         </w:rPr>
-        <w:t xml:space="preserve">Legibility check:</w:t>
-      </w:r>
-      <w:r>
-        <w:t xml:space="preserve"> </w:t>
-      </w:r>
-      <w:r>
-        <w:t xml:space="preserve">body text at 14.5 pt on a 36 in poster is readable at roughly 4–5 ft. Do not go below 14 pt for body copy or 10 pt for references.</w:t>
+        <w:t xml:space="preserve">Legibility check (v7):</w:t>
+      </w:r>
+      <w:r>
+        <w:t xml:space="preserve"> </w:t>
+      </w:r>
+      <w:r>
+        <w:t xml:space="preserve">body text raised to</w:t>
+      </w:r>
+      <w:r>
+        <w:t xml:space="preserve"> </w:t>
+      </w:r>
+      <w:r>
+        <w:rPr>
+          <w:bCs/>
+          <w:b/>
+        </w:rPr>
+        <w:t xml:space="preserve">15 pt</w:t>
+      </w:r>
+      <w:r>
+        <w:t xml:space="preserve"> </w:t>
+      </w:r>
+      <w:r>
+        <w:t xml:space="preserve">after review flagged the poster as too dense. Do not go below 14 pt for body copy or 10 pt for references. Column 2 widened to 1.28fr so the cross-section reads as the dominant visual.</w:t>
       </w:r>
     </w:p>
     <w:p>
@@ -2623,7 +2639,7 @@
               <w:jc w:val="left"/>
             </w:pPr>
             <w:r>
-              <w:t xml:space="preserve">Failure-driven?</w:t>
+              <w:t xml:space="preserve">What increases it</w:t>
             </w:r>
           </w:p>
         </w:tc>
@@ -2675,7 +2691,7 @@
                 <w:bCs/>
                 <w:b/>
               </w:rPr>
-              <w:t xml:space="preserve">YES</w:t>
+              <w:t xml:space="preserve">Hydraulic failure</w:t>
             </w:r>
             <w:r>
               <w:t xml:space="preserve"> </w:t>
@@ -2737,7 +2753,7 @@
                 <w:bCs/>
                 <w:b/>
               </w:rPr>
-              <w:t xml:space="preserve">PARTLY</w:t>
+              <w:t xml:space="preserve">Always — worse on failure</w:t>
             </w:r>
             <w:r>
               <w:t xml:space="preserve"> </w:t>
@@ -2805,13 +2821,13 @@
                 <w:bCs/>
                 <w:b/>
               </w:rPr>
-              <w:t xml:space="preserve">NO</w:t>
-            </w:r>
-            <w:r>
-              <w:t xml:space="preserve"> </w:t>
-            </w:r>
-            <w:r>
-              <w:t xml:space="preserve">(gray)</w:t>
+              <w:t xml:space="preserve">System age; saturation can remobilise</w:t>
+            </w:r>
+            <w:r>
+              <w:t xml:space="preserve"> </w:t>
+            </w:r>
+            <w:r>
+              <w:t xml:space="preserve">(amber)</w:t>
             </w:r>
           </w:p>
         </w:tc>
@@ -2841,7 +2857,7 @@
               <w:jc w:val="left"/>
             </w:pPr>
             <w:r>
-              <w:t xml:space="preserve">Pass through essentially unaltered</w:t>
+              <w:t xml:space="preserve">Incompletely removed; mobility varies by compound. None measured beneath ESVA septic clusters</w:t>
             </w:r>
           </w:p>
         </w:tc>
@@ -2857,7 +2873,7 @@
                 <w:bCs/>
                 <w:b/>
               </w:rPr>
-              <w:t xml:space="preserve">NO</w:t>
+              <w:t xml:space="preserve">Always, regardless of condition</w:t>
             </w:r>
             <w:r>
               <w:t xml:space="preserve"> </w:t>
@@ -2871,7 +2887,86 @@
     </w:tbl>
     <w:p>
       <w:pPr>
-        <w:pStyle w:val="BodyText"/>
+        <w:pStyle w:val="BlockText"/>
+      </w:pPr>
+      <w:r>
+        <w:rPr>
+          <w:bCs/>
+          <w:b/>
+        </w:rPr>
+        <w:t xml:space="preserve">v7 change.</w:t>
+      </w:r>
+      <w:r>
+        <w:t xml:space="preserve"> </w:t>
+      </w:r>
+      <w:r>
+        <w:t xml:space="preserve">The column header was a binary</w:t>
+      </w:r>
+      <w:r>
+        <w:t xml:space="preserve"> </w:t>
+      </w:r>
+      <w:r>
+        <w:t xml:space="preserve">“</w:t>
+      </w:r>
+      <w:r>
+        <w:t xml:space="preserve">Failure-driven?</w:t>
+      </w:r>
+      <w:r>
+        <w:t xml:space="preserve">”</w:t>
+      </w:r>
+      <w:r>
+        <w:t xml:space="preserve">, which forced a yes/no onto processes that are not binary. Phosphorus in particular is use-driven but</w:t>
+      </w:r>
+      <w:r>
+        <w:t xml:space="preserve"> </w:t>
+      </w:r>
+      <w:r>
+        <w:rPr>
+          <w:iCs/>
+          <w:i/>
+        </w:rPr>
+        <w:t xml:space="preserve">can</w:t>
+      </w:r>
+      <w:r>
+        <w:t xml:space="preserve"> </w:t>
+      </w:r>
+      <w:r>
+        <w:t xml:space="preserve">be remobilised by saturation and reducing conditions. Reframing the column as</w:t>
+      </w:r>
+      <w:r>
+        <w:t xml:space="preserve"> </w:t>
+      </w:r>
+      <w:r>
+        <w:rPr>
+          <w:bCs/>
+          <w:b/>
+        </w:rPr>
+        <w:t xml:space="preserve">“</w:t>
+      </w:r>
+      <w:r>
+        <w:rPr>
+          <w:bCs/>
+          <w:b/>
+        </w:rPr>
+        <w:t xml:space="preserve">What increases it</w:t>
+      </w:r>
+      <w:r>
+        <w:rPr>
+          <w:bCs/>
+          <w:b/>
+        </w:rPr>
+        <w:t xml:space="preserve">”</w:t>
+      </w:r>
+      <w:r>
+        <w:t xml:space="preserve"> </w:t>
+      </w:r>
+      <w:r>
+        <w:t xml:space="preserve">resolves the tension between the two review comments without hedging the pathogens-vs-PFAS contrast that makes the table useful.</w:t>
+      </w:r>
+    </w:p>
+    <w:p>
+      <w:pPr>
+        <w:pStyle w:val="FirstParagraph"/>
       </w:pPr>
       <w:r>
         <w:rPr>
@@ -8417,6 +8512,498 @@
             </w:r>
             <w:r>
               <w:t xml:space="preserve">.</w:t>
+            </w:r>
+          </w:p>
+        </w:tc>
+      </w:tr>
+      <w:tr>
+        <w:tc>
+          <w:tcPr/>
+          <w:p>
+            <w:pPr>
+              <w:pStyle w:val="Compact"/>
+              <w:jc w:val="left"/>
+            </w:pPr>
+            <w:r>
+              <w:t xml:space="preserve">17</w:t>
+            </w:r>
+          </w:p>
+        </w:tc>
+        <w:tc>
+          <w:tcPr/>
+          <w:p>
+            <w:pPr>
+              <w:pStyle w:val="Compact"/>
+              <w:jc w:val="left"/>
+            </w:pPr>
+            <w:r>
+              <w:t xml:space="preserve">External scientific review: evidence labels said</w:t>
+            </w:r>
+            <w:r>
+              <w:t xml:space="preserve"> </w:t>
+            </w:r>
+            <w:r>
+              <w:t xml:space="preserve">“</w:t>
+            </w:r>
+            <w:r>
+              <w:t xml:space="preserve">STRONG</w:t>
+            </w:r>
+            <w:r>
+              <w:t xml:space="preserve">”</w:t>
+            </w:r>
+            <w:r>
+              <w:t xml:space="preserve"> </w:t>
+            </w:r>
+            <w:r>
+              <w:t xml:space="preserve">for ESVA pathways while the same poster said no local apportionment exists</w:t>
+            </w:r>
+          </w:p>
+        </w:tc>
+        <w:tc>
+          <w:tcPr/>
+          <w:p>
+            <w:pPr>
+              <w:pStyle w:val="Compact"/>
+              <w:jc w:val="left"/>
+            </w:pPr>
+            <w:r>
+              <w:rPr>
+                <w:bCs/>
+                <w:b/>
+              </w:rPr>
+              <w:t xml:space="preserve">Fixed (v6) — this was the most important correction.</w:t>
+            </w:r>
+            <w:r>
+              <w:t xml:space="preserve"> </w:t>
+            </w:r>
+            <w:r>
+              <w:t xml:space="preserve">The pathway table now rates two axes separately:</w:t>
+            </w:r>
+            <w:r>
+              <w:t xml:space="preserve"> </w:t>
+            </w:r>
+            <w:r>
+              <w:rPr>
+                <w:bCs/>
+                <w:b/>
+              </w:rPr>
+              <w:t xml:space="preserve">mechanism</w:t>
+            </w:r>
+            <w:r>
+              <w:t xml:space="preserve"> </w:t>
+            </w:r>
+            <w:r>
+              <w:t xml:space="preserve">(general literature) and</w:t>
+            </w:r>
+            <w:r>
+              <w:t xml:space="preserve"> </w:t>
+            </w:r>
+            <w:r>
+              <w:rPr>
+                <w:bCs/>
+                <w:b/>
+              </w:rPr>
+              <w:t xml:space="preserve">ESVA septic attribution</w:t>
+            </w:r>
+            <w:r>
+              <w:t xml:space="preserve">. Reads as</w:t>
+            </w:r>
+            <w:r>
+              <w:t xml:space="preserve"> </w:t>
+            </w:r>
+            <w:r>
+              <w:t xml:space="preserve">“</w:t>
+            </w:r>
+            <w:r>
+              <w:t xml:space="preserve">established science, unmeasured locally.</w:t>
+            </w:r>
+            <w:r>
+              <w:t xml:space="preserve">”</w:t>
+            </w:r>
+          </w:p>
+        </w:tc>
+      </w:tr>
+      <w:tr>
+        <w:tc>
+          <w:tcPr/>
+          <w:p>
+            <w:pPr>
+              <w:pStyle w:val="Compact"/>
+              <w:jc w:val="left"/>
+            </w:pPr>
+            <w:r>
+              <w:t xml:space="preserve">18</w:t>
+            </w:r>
+          </w:p>
+        </w:tc>
+        <w:tc>
+          <w:tcPr/>
+          <w:p>
+            <w:pPr>
+              <w:pStyle w:val="Compact"/>
+              <w:jc w:val="left"/>
+            </w:pPr>
+            <w:r>
+              <w:t xml:space="preserve">Conflated unsaturated soil beneath the trench with depth to groundwater from land surface</w:t>
+            </w:r>
+          </w:p>
+        </w:tc>
+        <w:tc>
+          <w:tcPr/>
+          <w:p>
+            <w:pPr>
+              <w:pStyle w:val="Compact"/>
+              <w:jc w:val="left"/>
+            </w:pPr>
+            <w:r>
+              <w:rPr>
+                <w:bCs/>
+                <w:b/>
+              </w:rPr>
+              <w:t xml:space="preserve">Fixed.</w:t>
+            </w:r>
+            <w:r>
+              <w:t xml:space="preserve"> </w:t>
+            </w:r>
+            <w:r>
+              <w:t xml:space="preserve">Virginia sets separation by system type and effluent quality (12VAC5-610 Tables 4.3/4.4); there is no flat 3 ft. The 7,800 figure is now labelled as parcels with</w:t>
+            </w:r>
+            <w:r>
+              <w:t xml:space="preserve"> </w:t>
+            </w:r>
+            <w:r>
+              <w:rPr>
+                <w:iCs/>
+                <w:i/>
+              </w:rPr>
+              <w:t xml:space="preserve">modelled</w:t>
+            </w:r>
+            <w:r>
+              <w:t xml:space="preserve"> </w:t>
+            </w:r>
+            <w:r>
+              <w:t xml:space="preserve">groundwater &lt;3 ft</w:t>
+            </w:r>
+            <w:r>
+              <w:t xml:space="preserve"> </w:t>
+            </w:r>
+            <w:r>
+              <w:rPr>
+                <w:bCs/>
+                <w:b/>
+              </w:rPr>
+              <w:t xml:space="preserve">below land surface</w:t>
+            </w:r>
+            <w:r>
+              <w:t xml:space="preserve">.</w:t>
+            </w:r>
+          </w:p>
+        </w:tc>
+      </w:tr>
+      <w:tr>
+        <w:tc>
+          <w:tcPr/>
+          <w:p>
+            <w:pPr>
+              <w:pStyle w:val="Compact"/>
+              <w:jc w:val="left"/>
+            </w:pPr>
+            <w:r>
+              <w:t xml:space="preserve">19</w:t>
+            </w:r>
+          </w:p>
+        </w:tc>
+        <w:tc>
+          <w:tcPr/>
+          <w:p>
+            <w:pPr>
+              <w:pStyle w:val="Compact"/>
+              <w:jc w:val="left"/>
+            </w:pPr>
+            <w:r>
+              <w:t xml:space="preserve">“</w:t>
+            </w:r>
+            <w:r>
+              <w:t xml:space="preserve">What enters the groundwater arrives at the creek</w:t>
+            </w:r>
+            <w:r>
+              <w:t xml:space="preserve">”</w:t>
+            </w:r>
+            <w:r>
+              <w:t xml:space="preserve">;</w:t>
+            </w:r>
+            <w:r>
+              <w:t xml:space="preserve"> </w:t>
+            </w:r>
+            <w:r>
+              <w:t xml:space="preserve">“</w:t>
+            </w:r>
+            <w:r>
+              <w:t xml:space="preserve">not currently degraded by septic</w:t>
+            </w:r>
+            <w:r>
+              <w:t xml:space="preserve">”</w:t>
+            </w:r>
+            <w:r>
+              <w:t xml:space="preserve">; shellfish closures implied attributed to septic; PFAS</w:t>
+            </w:r>
+            <w:r>
+              <w:t xml:space="preserve"> </w:t>
+            </w:r>
+            <w:r>
+              <w:t xml:space="preserve">“</w:t>
+            </w:r>
+            <w:r>
+              <w:t xml:space="preserve">pass through essentially unaltered</w:t>
+            </w:r>
+            <w:r>
+              <w:t xml:space="preserve">”</w:t>
+            </w:r>
+            <w:r>
+              <w:t xml:space="preserve">;</w:t>
+            </w:r>
+            <w:r>
+              <w:t xml:space="preserve"> </w:t>
+            </w:r>
+            <w:r>
+              <w:t xml:space="preserve">“</w:t>
+            </w:r>
+            <w:r>
+              <w:t xml:space="preserve">progressive and unavoidable</w:t>
+            </w:r>
+            <w:r>
+              <w:t xml:space="preserve">”</w:t>
+            </w:r>
+            <w:r>
+              <w:t xml:space="preserve">;</w:t>
+            </w:r>
+            <w:r>
+              <w:t xml:space="preserve"> </w:t>
+            </w:r>
+            <w:r>
+              <w:t xml:space="preserve">“</w:t>
+            </w:r>
+            <w:r>
+              <w:t xml:space="preserve">Nationally ~32%</w:t>
+            </w:r>
+            <w:r>
+              <w:t xml:space="preserve">”</w:t>
+            </w:r>
+          </w:p>
+        </w:tc>
+        <w:tc>
+          <w:tcPr/>
+          <w:p>
+            <w:pPr>
+              <w:pStyle w:val="Compact"/>
+              <w:jc w:val="left"/>
+            </w:pPr>
+            <w:r>
+              <w:rPr>
+                <w:bCs/>
+                <w:b/>
+              </w:rPr>
+              <w:t xml:space="preserve">All softened to match the evidence.</w:t>
+            </w:r>
+            <w:r>
+              <w:t xml:space="preserve"> </w:t>
+            </w:r>
+            <w:r>
+              <w:t xml:space="preserve">Notably</w:t>
+            </w:r>
+            <w:r>
+              <w:t xml:space="preserve"> </w:t>
+            </w:r>
+            <w:r>
+              <w:t xml:space="preserve">“</w:t>
+            </w:r>
+            <w:r>
+              <w:t xml:space="preserve">not currently degraded</w:t>
+            </w:r>
+            <w:r>
+              <w:t xml:space="preserve">”</w:t>
+            </w:r>
+            <w:r>
+              <w:t xml:space="preserve"> </w:t>
+            </w:r>
+            <w:r>
+              <w:t xml:space="preserve">was absence-of-evidence stated as evidence-of-absence.</w:t>
+            </w:r>
+          </w:p>
+        </w:tc>
+      </w:tr>
+      <w:tr>
+        <w:tc>
+          <w:tcPr/>
+          <w:p>
+            <w:pPr>
+              <w:pStyle w:val="Compact"/>
+              <w:jc w:val="left"/>
+            </w:pPr>
+            <w:r>
+              <w:t xml:space="preserve">20</w:t>
+            </w:r>
+          </w:p>
+        </w:tc>
+        <w:tc>
+          <w:tcPr/>
+          <w:p>
+            <w:pPr>
+              <w:pStyle w:val="Compact"/>
+              <w:jc w:val="left"/>
+            </w:pPr>
+            <w:r>
+              <w:t xml:space="preserve">Lagoon flushing claim too categorical</w:t>
+            </w:r>
+          </w:p>
+        </w:tc>
+        <w:tc>
+          <w:tcPr/>
+          <w:p>
+            <w:pPr>
+              <w:pStyle w:val="Compact"/>
+              <w:jc w:val="left"/>
+            </w:pPr>
+            <w:r>
+              <w:rPr>
+                <w:bCs/>
+                <w:b/>
+              </w:rPr>
+              <w:t xml:space="preserve">Fixed, and strengthened.</w:t>
+            </w:r>
+            <w:r>
+              <w:t xml:space="preserve"> </w:t>
+            </w:r>
+            <w:r>
+              <w:t xml:space="preserve">Residence is days–weeks in open interiors (Safak et al. 2015). Replaced with the better point the reviewer missed:</w:t>
+            </w:r>
+            <w:r>
+              <w:t xml:space="preserve"> </w:t>
+            </w:r>
+            <w:r>
+              <w:rPr>
+                <w:bCs/>
+                <w:b/>
+              </w:rPr>
+              <w:t xml:space="preserve">nitrogen is retained longer than water</w:t>
+            </w:r>
+            <w:r>
+              <w:t xml:space="preserve">, via drift-algal DON uptake and release (Tyler, McGlathery &amp; Anderson 2001, 2003).</w:t>
+            </w:r>
+          </w:p>
+        </w:tc>
+      </w:tr>
+      <w:tr>
+        <w:tc>
+          <w:tcPr/>
+          <w:p>
+            <w:pPr>
+              <w:pStyle w:val="Compact"/>
+              <w:jc w:val="left"/>
+            </w:pPr>
+            <w:r>
+              <w:t xml:space="preserve">21</w:t>
+            </w:r>
+          </w:p>
+        </w:tc>
+        <w:tc>
+          <w:tcPr/>
+          <w:p>
+            <w:pPr>
+              <w:pStyle w:val="Compact"/>
+              <w:jc w:val="left"/>
+            </w:pPr>
+            <w:r>
+              <w:t xml:space="preserve">“</w:t>
+            </w:r>
+            <w:r>
+              <w:t xml:space="preserve">The single measurement that would convert this argument from precautionary to quantitative</w:t>
+            </w:r>
+            <w:r>
+              <w:t xml:space="preserve">”</w:t>
+            </w:r>
+          </w:p>
+        </w:tc>
+        <w:tc>
+          <w:tcPr/>
+          <w:p>
+            <w:pPr>
+              <w:pStyle w:val="Compact"/>
+              <w:jc w:val="left"/>
+            </w:pPr>
+            <w:r>
+              <w:rPr>
+                <w:bCs/>
+                <w:b/>
+              </w:rPr>
+              <w:t xml:space="preserve">Fixed.</w:t>
+            </w:r>
+            <w:r>
+              <w:t xml:space="preserve"> </w:t>
+            </w:r>
+            <w:r>
+              <w:t xml:space="preserve">Septic and manure nitrate isotopes overlap and caffeine degrades. Reframed as one</w:t>
+            </w:r>
+            <w:r>
+              <w:t xml:space="preserve"> </w:t>
+            </w:r>
+            <w:r>
+              <w:rPr>
+                <w:bCs/>
+                <w:b/>
+              </w:rPr>
+              <w:t xml:space="preserve">integrated attribution programme</w:t>
+            </w:r>
+            <w:r>
+              <w:t xml:space="preserve">: isotopes + conservative human-wastewater tracers + groundwater age/flow paths + HF183/crAssphage + seasonal/post-rain sampling + Bayesian apportionment.</w:t>
+            </w:r>
+          </w:p>
+        </w:tc>
+      </w:tr>
+      <w:tr>
+        <w:tc>
+          <w:tcPr/>
+          <w:p>
+            <w:pPr>
+              <w:pStyle w:val="Compact"/>
+              <w:jc w:val="left"/>
+            </w:pPr>
+            <w:r>
+              <w:t xml:space="preserve">22</w:t>
+            </w:r>
+          </w:p>
+        </w:tc>
+        <w:tc>
+          <w:tcPr/>
+          <w:p>
+            <w:pPr>
+              <w:pStyle w:val="Compact"/>
+              <w:jc w:val="left"/>
+            </w:pPr>
+            <w:r>
+              <w:t xml:space="preserve">Poster too dense for 36×24</w:t>
+            </w:r>
+          </w:p>
+        </w:tc>
+        <w:tc>
+          <w:tcPr/>
+          <w:p>
+            <w:pPr>
+              <w:pStyle w:val="Compact"/>
+              <w:jc w:val="left"/>
+            </w:pPr>
+            <w:r>
+              <w:rPr>
+                <w:bCs/>
+                <w:b/>
+              </w:rPr>
+              <w:t xml:space="preserve">Trimmed (v7).</w:t>
+            </w:r>
+            <w:r>
+              <w:t xml:space="preserve"> </w:t>
+            </w:r>
+            <w:r>
+              <w:t xml:space="preserve">Body 13.5→15 pt, tables and captions up, column 2 widened for the cross-section. Dropped the drainfield-footprint pathway row and its data gap (weakest link), three partnership tags, two references, and ~15% of prose.</w:t>
             </w:r>
           </w:p>
         </w:tc>

</xml_diff>